<commit_message>
Unit 3 look-over: every spec re-derived and read whole; slide fractions set display-size, warm-up text measured with real font metrics; source citations tightened; reference-sheet table widened
Co-Authored-By: Claude Fable 5.1 <noreply@anthropic.com>
Claude-Session: https://claude.ai/code/session_015xYWeLUsuszQH6z7ADE9tj
</commit_message>
<xml_diff>
--- a/a7/build/out/u3/A7 3  Reference Sheet.docx
+++ b/a7/build/out/u3/A7 3  Reference Sheet.docx
@@ -321,6 +321,7 @@
           </w:tcPr>
           <w:p>
             <w:pPr>
+              <w:keepNext/>
               <w:spacing w:after="0"/>
               <w:jc w:val="center"/>
             </w:pPr>
@@ -354,6 +355,7 @@
           </w:tcPr>
           <w:p>
             <w:pPr>
+              <w:keepNext/>
               <w:spacing w:after="0"/>
               <w:jc w:val="center"/>
             </w:pPr>
@@ -387,6 +389,7 @@
           </w:tcPr>
           <w:p>
             <w:pPr>
+              <w:keepNext/>
               <w:spacing w:after="0"/>
               <w:jc w:val="center"/>
             </w:pPr>
@@ -424,6 +427,7 @@
           </w:tcPr>
           <w:p>
             <w:pPr>
+              <w:keepNext/>
               <w:spacing w:after="0"/>
             </w:pPr>
             <w:r>
@@ -455,6 +459,7 @@
           </w:tcPr>
           <w:p>
             <w:pPr>
+              <w:keepNext/>
               <w:spacing w:after="0"/>
             </w:pPr>
             <w:r>
@@ -511,6 +516,7 @@
           </w:tcPr>
           <w:p>
             <w:pPr>
+              <w:keepNext/>
               <w:spacing w:after="0"/>
             </w:pPr>
             <w:r>
@@ -572,6 +578,7 @@
           </w:tcPr>
           <w:p>
             <w:pPr>
+              <w:keepNext/>
               <w:spacing w:after="0"/>
             </w:pPr>
             <w:r>
@@ -603,6 +610,7 @@
           </w:tcPr>
           <w:p>
             <w:pPr>
+              <w:keepNext/>
               <w:spacing w:after="0"/>
             </w:pPr>
             <w:r>
@@ -659,6 +667,7 @@
           </w:tcPr>
           <w:p>
             <w:pPr>
+              <w:keepNext/>
               <w:spacing w:after="0"/>
             </w:pPr>
             <w:r>
@@ -720,6 +729,7 @@
           </w:tcPr>
           <w:p>
             <w:pPr>
+              <w:keepNext/>
               <w:spacing w:after="0"/>
             </w:pPr>
             <w:r>
@@ -751,6 +761,7 @@
           </w:tcPr>
           <w:p>
             <w:pPr>
+              <w:keepNext/>
               <w:spacing w:after="0"/>
             </w:pPr>
             <w:r>
@@ -807,6 +818,7 @@
           </w:tcPr>
           <w:p>
             <w:pPr>
+              <w:keepNext/>
               <w:spacing w:after="0"/>
             </w:pPr>
             <w:r>
@@ -868,6 +880,7 @@
           </w:tcPr>
           <w:p>
             <w:pPr>
+              <w:keepNext/>
               <w:spacing w:after="0"/>
             </w:pPr>
             <w:r>
@@ -899,6 +912,7 @@
           </w:tcPr>
           <w:p>
             <w:pPr>
+              <w:keepNext/>
               <w:spacing w:after="0"/>
             </w:pPr>
             <w:r>
@@ -955,6 +969,7 @@
           </w:tcPr>
           <w:p>
             <w:pPr>
+              <w:keepNext/>
               <w:spacing w:after="0"/>
             </w:pPr>
             <w:r>
@@ -1016,6 +1031,7 @@
           </w:tcPr>
           <w:p>
             <w:pPr>
+              <w:keepNext/>
               <w:spacing w:after="0"/>
             </w:pPr>
             <w:r>
@@ -1047,6 +1063,7 @@
           </w:tcPr>
           <w:p>
             <w:pPr>
+              <w:keepNext/>
               <w:spacing w:after="0"/>
             </w:pPr>
             <w:r>
@@ -1103,6 +1120,7 @@
           </w:tcPr>
           <w:p>
             <w:pPr>
+              <w:keepNext/>
               <w:spacing w:after="0"/>
             </w:pPr>
             <w:r>
@@ -1164,6 +1182,7 @@
           </w:tcPr>
           <w:p>
             <w:pPr>
+              <w:keepNext/>
               <w:spacing w:after="0"/>
             </w:pPr>
             <w:r>
@@ -1195,6 +1214,7 @@
           </w:tcPr>
           <w:p>
             <w:pPr>
+              <w:keepNext/>
               <w:spacing w:after="0"/>
             </w:pPr>
             <w:r>
@@ -1303,6 +1323,7 @@
           </w:tcPr>
           <w:p>
             <w:pPr>
+              <w:keepNext/>
               <w:spacing w:after="0"/>
             </w:pPr>
             <w:r>
@@ -2148,6 +2169,7 @@
           </w:tcPr>
           <w:p>
             <w:pPr>
+              <w:keepNext/>
               <w:spacing w:after="0"/>
             </w:pPr>
             <w:r>
@@ -2204,6 +2226,7 @@
           </w:tcPr>
           <w:p>
             <w:pPr>
+              <w:keepNext/>
               <w:spacing w:after="0"/>
             </w:pPr>
             <w:r>
@@ -2260,6 +2283,7 @@
           </w:tcPr>
           <w:p>
             <w:pPr>
+              <w:keepNext/>
               <w:spacing w:after="0"/>
             </w:pPr>
             <w:r>
@@ -2316,6 +2340,7 @@
           </w:tcPr>
           <w:p>
             <w:pPr>
+              <w:keepNext/>
               <w:spacing w:after="0"/>
             </w:pPr>
             <w:r>
@@ -2372,6 +2397,7 @@
           </w:tcPr>
           <w:p>
             <w:pPr>
+              <w:keepNext/>
               <w:spacing w:after="0"/>
             </w:pPr>
             <w:r>
@@ -2428,6 +2454,7 @@
           </w:tcPr>
           <w:p>
             <w:pPr>
+              <w:keepNext/>
               <w:spacing w:after="0"/>
             </w:pPr>
             <w:r>
@@ -2484,6 +2511,7 @@
           </w:tcPr>
           <w:p>
             <w:pPr>
+              <w:keepNext/>
               <w:spacing w:after="0"/>
             </w:pPr>
             <w:r>
@@ -2540,6 +2568,7 @@
           </w:tcPr>
           <w:p>
             <w:pPr>
+              <w:keepNext/>
               <w:spacing w:after="0"/>
             </w:pPr>
             <w:r>
@@ -3837,6 +3866,7 @@
           </w:tcPr>
           <w:p>
             <w:pPr>
+              <w:keepNext/>
               <w:spacing w:after="0"/>
               <w:jc w:val="center"/>
             </w:pPr>
@@ -3870,6 +3900,7 @@
           </w:tcPr>
           <w:p>
             <w:pPr>
+              <w:keepNext/>
               <w:spacing w:after="0"/>
               <w:jc w:val="center"/>
             </w:pPr>
@@ -3903,6 +3934,7 @@
           </w:tcPr>
           <w:p>
             <w:pPr>
+              <w:keepNext/>
               <w:spacing w:after="0"/>
               <w:jc w:val="center"/>
             </w:pPr>
@@ -3940,6 +3972,7 @@
           </w:tcPr>
           <w:p>
             <w:pPr>
+              <w:keepNext/>
               <w:spacing w:after="0"/>
             </w:pPr>
             <w:r>
@@ -3996,6 +4029,7 @@
           </w:tcPr>
           <w:p>
             <w:pPr>
+              <w:keepNext/>
               <w:spacing w:after="0"/>
             </w:pPr>
             <w:r>
@@ -4052,6 +4086,7 @@
           </w:tcPr>
           <w:p>
             <w:pPr>
+              <w:keepNext/>
               <w:spacing w:after="0"/>
             </w:pPr>
             <w:r>
@@ -5068,6 +5103,7 @@
           </w:tcPr>
           <w:p>
             <w:pPr>
+              <w:keepNext/>
               <w:spacing w:after="0"/>
               <w:jc w:val="center"/>
             </w:pPr>
@@ -5092,6 +5128,7 @@
           </w:tcPr>
           <w:p>
             <w:pPr>
+              <w:keepNext/>
               <w:spacing w:after="0"/>
               <w:jc w:val="center"/>
             </w:pPr>
@@ -5125,6 +5162,7 @@
           </w:tcPr>
           <w:p>
             <w:pPr>
+              <w:keepNext/>
               <w:spacing w:after="0"/>
               <w:jc w:val="center"/>
             </w:pPr>
@@ -5162,6 +5200,7 @@
           </w:tcPr>
           <w:p>
             <w:pPr>
+              <w:keepNext/>
               <w:spacing w:after="0"/>
             </w:pPr>
             <w:r>
@@ -5193,6 +5232,7 @@
           </w:tcPr>
           <w:p>
             <w:pPr>
+              <w:keepNext/>
               <w:spacing w:after="0"/>
             </w:pPr>
             <w:r>
@@ -5224,6 +5264,7 @@
           </w:tcPr>
           <w:p>
             <w:pPr>
+              <w:keepNext/>
               <w:spacing w:after="0"/>
             </w:pPr>
             <w:r>
@@ -5260,6 +5301,7 @@
           </w:tcPr>
           <w:p>
             <w:pPr>
+              <w:keepNext/>
               <w:spacing w:after="0"/>
             </w:pPr>
             <w:r>
@@ -5291,6 +5333,7 @@
           </w:tcPr>
           <w:p>
             <w:pPr>
+              <w:keepNext/>
               <w:spacing w:after="0"/>
             </w:pPr>
             <w:r>
@@ -5322,6 +5365,7 @@
           </w:tcPr>
           <w:p>
             <w:pPr>
+              <w:keepNext/>
               <w:spacing w:after="0"/>
             </w:pPr>
             <w:r>
@@ -5358,6 +5402,7 @@
           </w:tcPr>
           <w:p>
             <w:pPr>
+              <w:keepNext/>
               <w:spacing w:after="0"/>
             </w:pPr>
             <w:r>
@@ -5389,6 +5434,7 @@
           </w:tcPr>
           <w:p>
             <w:pPr>
+              <w:keepNext/>
               <w:spacing w:after="0"/>
             </w:pPr>
             <w:r>
@@ -5454,6 +5500,7 @@
           </w:tcPr>
           <w:p>
             <w:pPr>
+              <w:keepNext/>
               <w:spacing w:after="0"/>
             </w:pPr>
             <w:r>
@@ -6067,9 +6114,9 @@
         <w:tblW w:w="9360" w:type="dxa"/>
       </w:tblPr>
       <w:tblGrid>
-        <w:gridCol w:w="2600"/>
-        <w:gridCol w:w="3500"/>
-        <w:gridCol w:w="3260"/>
+        <w:gridCol w:w="2300"/>
+        <w:gridCol w:w="3100"/>
+        <w:gridCol w:w="3960"/>
       </w:tblGrid>
       <w:tr>
         <w:trPr>
@@ -6078,7 +6125,7 @@
         </w:trPr>
         <w:tc>
           <w:tcPr>
-            <w:tcW w:type="dxa" w:w="2600"/>
+            <w:tcW w:type="dxa" w:w="2300"/>
             <w:tcMar>
               <w:top w:w="60" w:type="dxa"/>
               <w:left w:w="100" w:type="dxa"/>
@@ -6095,6 +6142,7 @@
           </w:tcPr>
           <w:p>
             <w:pPr>
+              <w:keepNext/>
               <w:spacing w:after="0"/>
               <w:jc w:val="center"/>
             </w:pPr>
@@ -6111,7 +6159,7 @@
         </w:tc>
         <w:tc>
           <w:tcPr>
-            <w:tcW w:type="dxa" w:w="3500"/>
+            <w:tcW w:type="dxa" w:w="3100"/>
             <w:tcMar>
               <w:top w:w="60" w:type="dxa"/>
               <w:left w:w="100" w:type="dxa"/>
@@ -6128,6 +6176,7 @@
           </w:tcPr>
           <w:p>
             <w:pPr>
+              <w:keepNext/>
               <w:spacing w:after="0"/>
               <w:jc w:val="center"/>
             </w:pPr>
@@ -6144,7 +6193,7 @@
         </w:tc>
         <w:tc>
           <w:tcPr>
-            <w:tcW w:type="dxa" w:w="3260"/>
+            <w:tcW w:type="dxa" w:w="3960"/>
             <w:tcMar>
               <w:top w:w="60" w:type="dxa"/>
               <w:left w:w="100" w:type="dxa"/>
@@ -6161,6 +6210,7 @@
           </w:tcPr>
           <w:p>
             <w:pPr>
+              <w:keepNext/>
               <w:spacing w:after="0"/>
               <w:jc w:val="center"/>
             </w:pPr>
@@ -6182,7 +6232,7 @@
         </w:trPr>
         <w:tc>
           <w:tcPr>
-            <w:tcW w:type="dxa" w:w="2600"/>
+            <w:tcW w:type="dxa" w:w="2300"/>
             <w:tcMar>
               <w:top w:w="60" w:type="dxa"/>
               <w:left w:w="100" w:type="dxa"/>
@@ -6198,6 +6248,7 @@
           </w:tcPr>
           <w:p>
             <w:pPr>
+              <w:keepNext/>
               <w:spacing w:after="0"/>
             </w:pPr>
             <w:r>
@@ -6213,7 +6264,7 @@
         </w:tc>
         <w:tc>
           <w:tcPr>
-            <w:tcW w:type="dxa" w:w="3500"/>
+            <w:tcW w:type="dxa" w:w="3100"/>
             <w:tcMar>
               <w:top w:w="60" w:type="dxa"/>
               <w:left w:w="100" w:type="dxa"/>
@@ -6229,6 +6280,7 @@
           </w:tcPr>
           <w:p>
             <w:pPr>
+              <w:keepNext/>
               <w:spacing w:after="0"/>
             </w:pPr>
             <w:r>
@@ -6269,7 +6321,7 @@
         </w:tc>
         <w:tc>
           <w:tcPr>
-            <w:tcW w:type="dxa" w:w="3260"/>
+            <w:tcW w:type="dxa" w:w="3960"/>
             <w:tcMar>
               <w:top w:w="60" w:type="dxa"/>
               <w:left w:w="100" w:type="dxa"/>
@@ -6285,6 +6337,7 @@
           </w:tcPr>
           <w:p>
             <w:pPr>
+              <w:keepNext/>
               <w:spacing w:after="0"/>
             </w:pPr>
             <w:r>
@@ -6339,7 +6392,7 @@
         </w:trPr>
         <w:tc>
           <w:tcPr>
-            <w:tcW w:type="dxa" w:w="2600"/>
+            <w:tcW w:type="dxa" w:w="2300"/>
             <w:tcMar>
               <w:top w:w="60" w:type="dxa"/>
               <w:left w:w="100" w:type="dxa"/>
@@ -6355,6 +6408,7 @@
           </w:tcPr>
           <w:p>
             <w:pPr>
+              <w:keepNext/>
               <w:spacing w:after="0"/>
             </w:pPr>
             <w:r>
@@ -6370,7 +6424,7 @@
         </w:tc>
         <w:tc>
           <w:tcPr>
-            <w:tcW w:type="dxa" w:w="3500"/>
+            <w:tcW w:type="dxa" w:w="3100"/>
             <w:tcMar>
               <w:top w:w="60" w:type="dxa"/>
               <w:left w:w="100" w:type="dxa"/>
@@ -6386,6 +6440,7 @@
           </w:tcPr>
           <w:p>
             <w:pPr>
+              <w:keepNext/>
               <w:spacing w:after="0"/>
             </w:pPr>
             <w:r>
@@ -6426,7 +6481,7 @@
         </w:tc>
         <w:tc>
           <w:tcPr>
-            <w:tcW w:type="dxa" w:w="3260"/>
+            <w:tcW w:type="dxa" w:w="3960"/>
             <w:tcMar>
               <w:top w:w="60" w:type="dxa"/>
               <w:left w:w="100" w:type="dxa"/>
@@ -6442,6 +6497,7 @@
           </w:tcPr>
           <w:p>
             <w:pPr>
+              <w:keepNext/>
               <w:spacing w:after="0"/>
             </w:pPr>
             <w:r>
@@ -6496,7 +6552,7 @@
         </w:trPr>
         <w:tc>
           <w:tcPr>
-            <w:tcW w:type="dxa" w:w="2600"/>
+            <w:tcW w:type="dxa" w:w="2300"/>
             <w:tcMar>
               <w:top w:w="60" w:type="dxa"/>
               <w:left w:w="100" w:type="dxa"/>
@@ -6512,6 +6568,7 @@
           </w:tcPr>
           <w:p>
             <w:pPr>
+              <w:keepNext/>
               <w:spacing w:after="0"/>
             </w:pPr>
             <w:r>
@@ -6527,7 +6584,7 @@
         </w:tc>
         <w:tc>
           <w:tcPr>
-            <w:tcW w:type="dxa" w:w="3500"/>
+            <w:tcW w:type="dxa" w:w="3100"/>
             <w:tcMar>
               <w:top w:w="60" w:type="dxa"/>
               <w:left w:w="100" w:type="dxa"/>
@@ -6543,6 +6600,7 @@
           </w:tcPr>
           <w:p>
             <w:pPr>
+              <w:keepNext/>
               <w:spacing w:after="0"/>
             </w:pPr>
             <w:r>
@@ -6583,7 +6641,7 @@
         </w:tc>
         <w:tc>
           <w:tcPr>
-            <w:tcW w:type="dxa" w:w="3260"/>
+            <w:tcW w:type="dxa" w:w="3960"/>
             <w:tcMar>
               <w:top w:w="60" w:type="dxa"/>
               <w:left w:w="100" w:type="dxa"/>
@@ -6599,6 +6657,7 @@
           </w:tcPr>
           <w:p>
             <w:pPr>
+              <w:keepNext/>
               <w:spacing w:after="0"/>
             </w:pPr>
             <w:r>
@@ -6653,7 +6712,7 @@
         </w:trPr>
         <w:tc>
           <w:tcPr>
-            <w:tcW w:type="dxa" w:w="2600"/>
+            <w:tcW w:type="dxa" w:w="2300"/>
             <w:tcMar>
               <w:top w:w="60" w:type="dxa"/>
               <w:left w:w="100" w:type="dxa"/>
@@ -6669,6 +6728,7 @@
           </w:tcPr>
           <w:p>
             <w:pPr>
+              <w:keepNext/>
               <w:spacing w:after="0"/>
             </w:pPr>
             <w:r>
@@ -6684,7 +6744,7 @@
         </w:tc>
         <w:tc>
           <w:tcPr>
-            <w:tcW w:type="dxa" w:w="3500"/>
+            <w:tcW w:type="dxa" w:w="3100"/>
             <w:tcMar>
               <w:top w:w="60" w:type="dxa"/>
               <w:left w:w="100" w:type="dxa"/>
@@ -6700,6 +6760,7 @@
           </w:tcPr>
           <w:p>
             <w:pPr>
+              <w:keepNext/>
               <w:spacing w:after="0"/>
             </w:pPr>
             <w:r>
@@ -6740,7 +6801,7 @@
         </w:tc>
         <w:tc>
           <w:tcPr>
-            <w:tcW w:type="dxa" w:w="3260"/>
+            <w:tcW w:type="dxa" w:w="3960"/>
             <w:tcMar>
               <w:top w:w="60" w:type="dxa"/>
               <w:left w:w="100" w:type="dxa"/>
@@ -6756,6 +6817,7 @@
           </w:tcPr>
           <w:p>
             <w:pPr>
+              <w:keepNext/>
               <w:spacing w:after="0"/>
             </w:pPr>
             <w:r>
@@ -6810,7 +6872,7 @@
         </w:trPr>
         <w:tc>
           <w:tcPr>
-            <w:tcW w:type="dxa" w:w="2600"/>
+            <w:tcW w:type="dxa" w:w="2300"/>
             <w:tcMar>
               <w:top w:w="60" w:type="dxa"/>
               <w:left w:w="100" w:type="dxa"/>
@@ -6841,7 +6903,7 @@
         </w:tc>
         <w:tc>
           <w:tcPr>
-            <w:tcW w:type="dxa" w:w="3500"/>
+            <w:tcW w:type="dxa" w:w="3100"/>
             <w:tcMar>
               <w:top w:w="60" w:type="dxa"/>
               <w:left w:w="100" w:type="dxa"/>
@@ -6897,7 +6959,7 @@
         </w:tc>
         <w:tc>
           <w:tcPr>
-            <w:tcW w:type="dxa" w:w="3260"/>
+            <w:tcW w:type="dxa" w:w="3960"/>
             <w:tcMar>
               <w:top w:w="60" w:type="dxa"/>
               <w:left w:w="100" w:type="dxa"/>

</xml_diff>